<commit_message>
Update Bible study notes and themes for arb, eng, fra, hin, ind, por, rus, swh, and zht languages for 2026-06-25 release
</commit_message>
<xml_diff>
--- a/eng/docx/003.content.docx
+++ b/eng/docx/003.content.docx
@@ -1404,7 +1404,7 @@
         <w:rPr>
           <w:lang w:val="en_US" w:bidi="en_US"/>
         </w:rPr>
-        <w:t>King David tried two times to bring the ark of God (also called "the ark of the LORD" or "the ark of the covenant") to Jerusalem (</w:t>
+        <w:t>King David tried two times to bring the ark of God (also called the ark of the LORD or the ark of the covenant) to Jerusalem (</w:t>
       </w:r>
       <w:hyperlink r:id="rId44">
         <w:r>
@@ -1454,7 +1454,13 @@
         <w:rPr>
           <w:lang w:val="en_US" w:bidi="en_US"/>
         </w:rPr>
-        <w:t xml:space="preserve">In the second procession with the ark, three Hebrew words describe "dancing" (see also </w:t>
+        <w:t>Four different Hebrew words describe how Israel and David rejoiced. Their joy included leaping, dancing, and playing music (see also</w:t>
+      </w:r>
+      <w:r>
+        <w:rPr>
+          <w:lang w:val="en_US" w:bidi="en_US"/>
+        </w:rPr>
+        <w:t xml:space="preserve"> </w:t>
       </w:r>
       <w:hyperlink r:id="rId46">
         <w:r>
@@ -1472,7 +1478,7 @@
         <w:rPr>
           <w:lang w:val="en_US" w:bidi="en_US"/>
         </w:rPr>
-        <w:t xml:space="preserve">): </w:t>
+        <w:t xml:space="preserve">). The four Hebrew words are: </w:t>
       </w:r>
     </w:p>
     <w:p>
@@ -1501,7 +1507,7 @@
         <w:rPr>
           <w:lang w:val="en_US" w:bidi="en_US"/>
         </w:rPr>
-        <w:t xml:space="preserve"> ("danced" in </w:t>
+        <w:t>, which means "to dance" (</w:t>
       </w:r>
       <w:hyperlink r:id="rId47">
         <w:r>
@@ -1537,7 +1543,7 @@
         <w:rPr>
           <w:lang w:val="en_US" w:bidi="en_US"/>
         </w:rPr>
-        <w:t>)</w:t>
+        <w:t>);</w:t>
       </w:r>
     </w:p>
     <w:p>
@@ -1562,7 +1568,13 @@
         <w:rPr>
           <w:lang w:val="en_US" w:bidi="en_US"/>
         </w:rPr>
-        <w:t xml:space="preserve"> ("leaping" in </w:t>
+        <w:t>, which means "to leap"</w:t>
+      </w:r>
+      <w:r>
+        <w:rPr>
+          <w:lang w:val="en_US" w:bidi="en_US"/>
+        </w:rPr>
+        <w:t xml:space="preserve"> (translated as "dancing" in the Berean Standard Bible in </w:t>
       </w:r>
       <w:hyperlink r:id="rId48">
         <w:r>
@@ -1580,7 +1592,7 @@
         <w:rPr>
           <w:lang w:val="en_US" w:bidi="en_US"/>
         </w:rPr>
-        <w:t>)</w:t>
+        <w:t>);</w:t>
       </w:r>
     </w:p>
     <w:p>
@@ -1605,7 +1617,13 @@
         <w:rPr>
           <w:lang w:val="en_US" w:bidi="en_US"/>
         </w:rPr>
-        <w:t xml:space="preserve"> ("dancing" in </w:t>
+        <w:t>, which also means "to leap"</w:t>
+      </w:r>
+      <w:r>
+        <w:rPr>
+          <w:lang w:val="en_US" w:bidi="en_US"/>
+        </w:rPr>
+        <w:t xml:space="preserve"> (again translated as "dancing" in the Berean Standard Bible in </w:t>
       </w:r>
       <w:hyperlink r:id="rId49">
         <w:r>
@@ -1623,7 +1641,74 @@
         <w:rPr>
           <w:lang w:val="en_US" w:bidi="en_US"/>
         </w:rPr>
-        <w:t>)</w:t>
+        <w:t>); and</w:t>
+      </w:r>
+    </w:p>
+    <w:p>
+      <w:pPr>
+        <w:pStyle w:val="ListNumber"/>
+        <w:spacing w:line="240" w:lineRule="auto"/>
+        <w:ind w:left="720"/>
+      </w:pPr>
+      <w:r>
+        <w:rPr>
+          <w:lang w:val="en_US" w:bidi="en_US"/>
+        </w:rPr>
+      </w:r>
+      <w:r>
+        <w:rPr>
+          <w:i/>
+          <w:lang w:val="en_US" w:bidi="en_US"/>
+        </w:rPr>
+        <w:t>sakhaq</w:t>
+      </w:r>
+      <w:r>
+        <w:rPr>
+          <w:lang w:val="en_US" w:bidi="en_US"/>
+        </w:rPr>
+        <w:t>, which means more generally "to rejoice", and which can suggest dancing, singing, and music</w:t>
+      </w:r>
+      <w:r>
+        <w:rPr>
+          <w:lang w:val="en_US" w:bidi="en_US"/>
+        </w:rPr>
+        <w:t xml:space="preserve"> (</w:t>
+      </w:r>
+      <w:hyperlink r:id="rId50">
+        <w:r>
+          <w:rPr>
+            <w:lang w:val="en_US" w:bidi="en_US"/>
+          </w:rPr>
+          <w:rPr>
+            <w:color w:val="0000EE"/>
+            <w:u w:val="single"/>
+          </w:rPr>
+          <w:t>2 Samuel 6:5</w:t>
+        </w:r>
+      </w:hyperlink>
+      <w:r>
+        <w:rPr>
+          <w:lang w:val="en_US" w:bidi="en_US"/>
+        </w:rPr>
+        <w:t xml:space="preserve">; </w:t>
+      </w:r>
+      <w:hyperlink r:id="rId49">
+        <w:r>
+          <w:rPr>
+            <w:lang w:val="en_US" w:bidi="en_US"/>
+          </w:rPr>
+          <w:rPr>
+            <w:color w:val="0000EE"/>
+            <w:u w:val="single"/>
+          </w:rPr>
+          <w:t>1 Chronicles 15:29</w:t>
+        </w:r>
+      </w:hyperlink>
+      <w:r>
+        <w:rPr>
+          <w:lang w:val="en_US" w:bidi="en_US"/>
+        </w:rPr>
+        <w:t xml:space="preserve">). </w:t>
       </w:r>
     </w:p>
     <w:p>
@@ -1637,25 +1722,7 @@
         <w:rPr>
           <w:lang w:val="en_US" w:bidi="en_US"/>
         </w:rPr>
-        <w:t>These words show a lively physical expression, unlike the Hebrew word for "celebrate" used in David's first attempt (</w:t>
-      </w:r>
-      <w:hyperlink r:id="rId50">
-        <w:r>
-          <w:rPr>
-            <w:lang w:val="en_US" w:bidi="en_US"/>
-          </w:rPr>
-          <w:rPr>
-            <w:color w:val="0000EE"/>
-            <w:u w:val="single"/>
-          </w:rPr>
-          <w:t>2 Samuel 6:5</w:t>
-        </w:r>
-      </w:hyperlink>
-      <w:r>
-        <w:rPr>
-          <w:lang w:val="en_US" w:bidi="en_US"/>
-        </w:rPr>
-        <w:t>). In the first procession with the ark, David celebrated. In the second, he danced joyfully and celebrated with music, shouting, and trumpets.</w:t>
+        <w:t>Together, these words show that their celebration included joyful movement with their bodies.</w:t>
       </w:r>
     </w:p>
     <w:p>

</xml_diff>